<commit_message>
Reenfocar el plan de Hosty56 en la gestión digital (Meta Ads)
Ajusta el alcance de ambos entregables: la gestión cubre únicamente
generar, calificar y filtrar interesados vía Meta Ads y entregarlos a
los propietarios. Se agrega una diapositiva/sección explícita de
"alcance" y "fuera de mi alcance" (NDA, llamadas, visitas, negociación,
legal y cierre quedan en manos de los propietarios). Se retiran el
guion de llamada telefónica y el protocolo de visita, reemplazados por
un protocolo de entrega de leads calificados. El honorario fijo cubre
la gestión digital; la comisión de éxito (3%) solo aplica si el
comprador final es entregado directamente por esta gestión.

Co-Authored-By: Claude Sonnet 5 <noreply@anthropic.com>
Claude-Session: https://claude.ai/code/session_01SmkHKcxHsRiRKSPUZSC2qb
</commit_message>
<xml_diff>
--- a/Hosty56 - Plan de Venta (Edificio Airbnb Bogota)/Hosty56_Plan_de_Trabajo.docx
+++ b/Hosty56 - Plan de Venta (Edificio Airbnb Bogota)/Hosty56_Plan_de_Trabajo.docx
@@ -16,7 +16,7 @@
           <w:sz w:val="22"/>
           <w:szCs w:val="22"/>
         </w:rPr>
-        <w:t xml:space="preserve">PLAN DE TRABAJO OPERATIVO</w:t>
+        <w:t xml:space="preserve">PLAN DE GESTIÓN DIGITAL</w:t>
       </w:r>
     </w:p>
     <w:p>
@@ -48,7 +48,7 @@
           <w:sz w:val="24"/>
           <w:szCs w:val="24"/>
         </w:rPr>
-        <w:t xml:space="preserve">Venta discreta de un activo único · Bogotá, Colombia · 2026</w:t>
+        <w:t xml:space="preserve">Generación y filtro de interesados vía Meta Ads · Bogotá, Colombia · 2026</w:t>
       </w:r>
     </w:p>
     <w:p>
@@ -84,7 +84,7 @@
           <w:sz w:val="30"/>
           <w:szCs w:val="30"/>
         </w:rPr>
-        <w:t xml:space="preserve">1. Resumen ejecutivo</w:t>
+        <w:t xml:space="preserve">1. Resumen y alcance de esta gestión</w:t>
       </w:r>
     </w:p>
     <w:p>
@@ -98,7 +98,7 @@
           <w:sz w:val="21"/>
           <w:szCs w:val="21"/>
         </w:rPr>
-        <w:t xml:space="preserve">Hosty56 es un edificio de 4 plantas y 10 apartamentos en Bogotá, en operación activa como renta corta (Airbnb), con una facturación bruta actual de $40.000.000 mensuales (~$480.000.000 al año). El edificio no está constituido en propiedad horizontal, por lo que no puede venderse por unidades: la venta debe hacerse del edificio completo, o de la sociedad que lo posee, a un único comprador.</w:t>
+        <w:t xml:space="preserve">Hosty56 es un edificio de 4 plantas y 10 apartamentos en Bogotá, en operación activa como renta corta (Airbnb), con una facturación bruta actual de $40.000.000 mensuales (~$480.000.000 al año). El edificio no está constituido en propiedad horizontal, por lo que la venta debe hacerse del edificio completo, o de la sociedad que lo posee, a un único comprador. El valor de venta es de $4.000.000.000.</w:t>
       </w:r>
     </w:p>
     <w:p>
@@ -112,7 +112,7 @@
           <w:sz w:val="21"/>
           <w:szCs w:val="21"/>
         </w:rPr>
-        <w:t xml:space="preserve">Este documento define el plan operativo para encontrar ese comprador en un plazo objetivo de 3 meses (con apertura a extenderlo si es necesario), usando Meta Ads como único canal de difusión, bajo un esquema de discreción y filtro estricto: el mercado nunca ve la dirección exacta ni las cifras financieras completas sin antes calificar y firmar un acuerdo de confidencialidad (NDA).</w:t>
+        <w:t xml:space="preserve">Este documento define exclusivamente mi gestión como encargado de la pauta digital (trafficker): generar, calificar y filtrar interesados reales a través de Meta Ads, y entregar a los propietarios únicamente los contactos con capacidad e interés genuino.</w:t>
       </w:r>
     </w:p>
     <w:p>
@@ -126,7 +126,7 @@
           <w:sz w:val="21"/>
           <w:szCs w:val="21"/>
         </w:rPr>
-        <w:t xml:space="preserve">El valor de venta del edificio es de $4.000.000.000.</w:t>
+        <w:t xml:space="preserve">A partir de la entrega de un interesado calificado, los propietarios gestionan directamente el NDA, el dossier confidencial, las llamadas de verificación, las visitas, la negociación y el cierre de la venta. Ese proceso no hace parte de esta gestión.</w:t>
       </w:r>
     </w:p>
     <w:p>
@@ -151,7 +151,328 @@
           <w:sz w:val="30"/>
           <w:szCs w:val="30"/>
         </w:rPr>
-        <w:t xml:space="preserve">2. El activo</w:t>
+        <w:t xml:space="preserve">2. Qué hago yo vs. qué gestionan los propietarios</w:t>
+      </w:r>
+    </w:p>
+    <w:tbl>
+      <w:tblPr>
+        <w:tblW w:type="dxa" w:w="9200"/>
+        <w:tblBorders>
+          <w:top w:val="single" w:color="auto" w:sz="4"/>
+          <w:left w:val="single" w:color="auto" w:sz="4"/>
+          <w:bottom w:val="single" w:color="auto" w:sz="4"/>
+          <w:right w:val="single" w:color="auto" w:sz="4"/>
+          <w:insideH w:val="single" w:color="auto" w:sz="4"/>
+          <w:insideV w:val="single" w:color="auto" w:sz="4"/>
+        </w:tblBorders>
+      </w:tblPr>
+      <w:tblGrid>
+        <w:gridCol w:w="4600"/>
+        <w:gridCol w:w="4600"/>
+      </w:tblGrid>
+      <w:tr>
+        <w:tc>
+          <w:tcPr>
+            <w:tcW w:type="dxa" w:w="4600"/>
+            <w:shd w:fill="1C1F26" w:val="clear"/>
+            <w:tcMar>
+              <w:top w:type="dxa" w:w="100"/>
+              <w:left w:type="dxa" w:w="150"/>
+              <w:bottom w:type="dxa" w:w="100"/>
+              <w:right w:type="dxa" w:w="150"/>
+            </w:tcMar>
+          </w:tcPr>
+          <w:p>
+            <w:r>
+              <w:rPr>
+                <w:rFonts w:ascii="Calibri" w:cs="Calibri" w:eastAsia="Calibri" w:hAnsi="Calibri"/>
+                <w:b/>
+                <w:bCs/>
+                <w:color w:val="FFFFFF"/>
+                <w:sz w:val="20"/>
+                <w:szCs w:val="20"/>
+              </w:rPr>
+              <w:t xml:space="preserve">Mi gestión (Meta Ads)</w:t>
+            </w:r>
+          </w:p>
+        </w:tc>
+        <w:tc>
+          <w:tcPr>
+            <w:tcW w:type="dxa" w:w="4600"/>
+            <w:shd w:fill="1C1F26" w:val="clear"/>
+            <w:tcMar>
+              <w:top w:type="dxa" w:w="100"/>
+              <w:left w:type="dxa" w:w="150"/>
+              <w:bottom w:type="dxa" w:w="100"/>
+              <w:right w:type="dxa" w:w="150"/>
+            </w:tcMar>
+          </w:tcPr>
+          <w:p>
+            <w:r>
+              <w:rPr>
+                <w:rFonts w:ascii="Calibri" w:cs="Calibri" w:eastAsia="Calibri" w:hAnsi="Calibri"/>
+                <w:b/>
+                <w:bCs/>
+                <w:color w:val="FFFFFF"/>
+                <w:sz w:val="20"/>
+                <w:szCs w:val="20"/>
+              </w:rPr>
+              <w:t xml:space="preserve">Gestión de los propietarios</w:t>
+            </w:r>
+          </w:p>
+        </w:tc>
+      </w:tr>
+      <w:tr>
+        <w:tc>
+          <w:tcPr>
+            <w:tcW w:type="dxa" w:w="4600"/>
+            <w:shd w:fill="FFFFFF" w:val="clear"/>
+            <w:tcMar>
+              <w:top w:type="dxa" w:w="100"/>
+              <w:left w:type="dxa" w:w="150"/>
+              <w:bottom w:type="dxa" w:w="100"/>
+              <w:right w:type="dxa" w:w="150"/>
+            </w:tcMar>
+          </w:tcPr>
+          <w:p>
+            <w:r>
+              <w:rPr>
+                <w:rFonts w:ascii="Calibri" w:cs="Calibri" w:eastAsia="Calibri" w:hAnsi="Calibri"/>
+                <w:b w:val="false"/>
+                <w:bCs w:val="false"/>
+                <w:color w:val="222222"/>
+                <w:sz w:val="20"/>
+                <w:szCs w:val="20"/>
+              </w:rPr>
+              <w:t xml:space="preserve">Difusión discreta del teaser</w:t>
+            </w:r>
+          </w:p>
+        </w:tc>
+        <w:tc>
+          <w:tcPr>
+            <w:tcW w:type="dxa" w:w="4600"/>
+            <w:shd w:fill="FFFFFF" w:val="clear"/>
+            <w:tcMar>
+              <w:top w:type="dxa" w:w="100"/>
+              <w:left w:type="dxa" w:w="150"/>
+              <w:bottom w:type="dxa" w:w="100"/>
+              <w:right w:type="dxa" w:w="150"/>
+            </w:tcMar>
+          </w:tcPr>
+          <w:p>
+            <w:r>
+              <w:rPr>
+                <w:rFonts w:ascii="Calibri" w:cs="Calibri" w:eastAsia="Calibri" w:hAnsi="Calibri"/>
+                <w:b w:val="false"/>
+                <w:bCs w:val="false"/>
+                <w:color w:val="222222"/>
+                <w:sz w:val="20"/>
+                <w:szCs w:val="20"/>
+              </w:rPr>
+              <w:t xml:space="preserve">NDA y entrega del dossier confidencial</w:t>
+            </w:r>
+          </w:p>
+        </w:tc>
+      </w:tr>
+      <w:tr>
+        <w:tc>
+          <w:tcPr>
+            <w:tcW w:type="dxa" w:w="4600"/>
+            <w:shd w:fill="F4F3F1" w:val="clear"/>
+            <w:tcMar>
+              <w:top w:type="dxa" w:w="100"/>
+              <w:left w:type="dxa" w:w="150"/>
+              <w:bottom w:type="dxa" w:w="100"/>
+              <w:right w:type="dxa" w:w="150"/>
+            </w:tcMar>
+          </w:tcPr>
+          <w:p>
+            <w:r>
+              <w:rPr>
+                <w:rFonts w:ascii="Calibri" w:cs="Calibri" w:eastAsia="Calibri" w:hAnsi="Calibri"/>
+                <w:b w:val="false"/>
+                <w:bCs w:val="false"/>
+                <w:color w:val="222222"/>
+                <w:sz w:val="20"/>
+                <w:szCs w:val="20"/>
+              </w:rPr>
+              <w:t xml:space="preserve">Landing y formulario de calificación</w:t>
+            </w:r>
+          </w:p>
+        </w:tc>
+        <w:tc>
+          <w:tcPr>
+            <w:tcW w:type="dxa" w:w="4600"/>
+            <w:shd w:fill="F4F3F1" w:val="clear"/>
+            <w:tcMar>
+              <w:top w:type="dxa" w:w="100"/>
+              <w:left w:type="dxa" w:w="150"/>
+              <w:bottom w:type="dxa" w:w="100"/>
+              <w:right w:type="dxa" w:w="150"/>
+            </w:tcMar>
+          </w:tcPr>
+          <w:p>
+            <w:r>
+              <w:rPr>
+                <w:rFonts w:ascii="Calibri" w:cs="Calibri" w:eastAsia="Calibri" w:hAnsi="Calibri"/>
+                <w:b w:val="false"/>
+                <w:bCs w:val="false"/>
+                <w:color w:val="222222"/>
+                <w:sz w:val="20"/>
+                <w:szCs w:val="20"/>
+              </w:rPr>
+              <w:t xml:space="preserve">Llamadas de verificación y visitas presenciales</w:t>
+            </w:r>
+          </w:p>
+        </w:tc>
+      </w:tr>
+      <w:tr>
+        <w:tc>
+          <w:tcPr>
+            <w:tcW w:type="dxa" w:w="4600"/>
+            <w:shd w:fill="FFFFFF" w:val="clear"/>
+            <w:tcMar>
+              <w:top w:type="dxa" w:w="100"/>
+              <w:left w:type="dxa" w:w="150"/>
+              <w:bottom w:type="dxa" w:w="100"/>
+              <w:right w:type="dxa" w:w="150"/>
+            </w:tcMar>
+          </w:tcPr>
+          <w:p>
+            <w:r>
+              <w:rPr>
+                <w:rFonts w:ascii="Calibri" w:cs="Calibri" w:eastAsia="Calibri" w:hAnsi="Calibri"/>
+                <w:b w:val="false"/>
+                <w:bCs w:val="false"/>
+                <w:color w:val="222222"/>
+                <w:sz w:val="20"/>
+                <w:szCs w:val="20"/>
+              </w:rPr>
+              <w:t xml:space="preserve">Filtro automático de curiosos</w:t>
+            </w:r>
+          </w:p>
+        </w:tc>
+        <w:tc>
+          <w:tcPr>
+            <w:tcW w:type="dxa" w:w="4600"/>
+            <w:shd w:fill="FFFFFF" w:val="clear"/>
+            <w:tcMar>
+              <w:top w:type="dxa" w:w="100"/>
+              <w:left w:type="dxa" w:w="150"/>
+              <w:bottom w:type="dxa" w:w="100"/>
+              <w:right w:type="dxa" w:w="150"/>
+            </w:tcMar>
+          </w:tcPr>
+          <w:p>
+            <w:r>
+              <w:rPr>
+                <w:rFonts w:ascii="Calibri" w:cs="Calibri" w:eastAsia="Calibri" w:hAnsi="Calibri"/>
+                <w:b w:val="false"/>
+                <w:bCs w:val="false"/>
+                <w:color w:val="222222"/>
+                <w:sz w:val="20"/>
+                <w:szCs w:val="20"/>
+              </w:rPr>
+              <w:t xml:space="preserve">Negociación y estructura de la oferta</w:t>
+            </w:r>
+          </w:p>
+        </w:tc>
+      </w:tr>
+      <w:tr>
+        <w:tc>
+          <w:tcPr>
+            <w:tcW w:type="dxa" w:w="4600"/>
+            <w:shd w:fill="F4F3F1" w:val="clear"/>
+            <w:tcMar>
+              <w:top w:type="dxa" w:w="100"/>
+              <w:left w:type="dxa" w:w="150"/>
+              <w:bottom w:type="dxa" w:w="100"/>
+              <w:right w:type="dxa" w:w="150"/>
+            </w:tcMar>
+          </w:tcPr>
+          <w:p>
+            <w:r>
+              <w:rPr>
+                <w:rFonts w:ascii="Calibri" w:cs="Calibri" w:eastAsia="Calibri" w:hAnsi="Calibri"/>
+                <w:b w:val="false"/>
+                <w:bCs w:val="false"/>
+                <w:color w:val="222222"/>
+                <w:sz w:val="20"/>
+                <w:szCs w:val="20"/>
+              </w:rPr>
+              <w:t xml:space="preserve">Entrega de interesados calificados</w:t>
+            </w:r>
+          </w:p>
+        </w:tc>
+        <w:tc>
+          <w:tcPr>
+            <w:tcW w:type="dxa" w:w="4600"/>
+            <w:shd w:fill="F4F3F1" w:val="clear"/>
+            <w:tcMar>
+              <w:top w:type="dxa" w:w="100"/>
+              <w:left w:type="dxa" w:w="150"/>
+              <w:bottom w:type="dxa" w:w="100"/>
+              <w:right w:type="dxa" w:w="150"/>
+            </w:tcMar>
+          </w:tcPr>
+          <w:p>
+            <w:r>
+              <w:rPr>
+                <w:rFonts w:ascii="Calibri" w:cs="Calibri" w:eastAsia="Calibri" w:hAnsi="Calibri"/>
+                <w:b w:val="false"/>
+                <w:bCs w:val="false"/>
+                <w:color w:val="222222"/>
+                <w:sz w:val="20"/>
+                <w:szCs w:val="20"/>
+              </w:rPr>
+              <w:t xml:space="preserve">Cierre de la venta y aspectos legales de la sociedad</w:t>
+            </w:r>
+          </w:p>
+        </w:tc>
+      </w:tr>
+    </w:tbl>
+    <w:p>
+      <w:pPr>
+        <w:spacing w:before="200"/>
+      </w:pPr>
+    </w:p>
+    <w:p>
+      <w:pPr>
+        <w:spacing w:after="140"/>
+      </w:pPr>
+      <w:r>
+        <w:rPr>
+          <w:rFonts w:ascii="Calibri" w:cs="Calibri" w:eastAsia="Calibri" w:hAnsi="Calibri"/>
+          <w:color w:val="222222"/>
+          <w:sz w:val="21"/>
+          <w:szCs w:val="21"/>
+        </w:rPr>
+        <w:t xml:space="preserve">Esta separación es intencional: mi responsabilidad termina en la entrega de un contacto calificado. Todo lo que ocurre después (verificación adicional, visitas, negociación, cierre) queda enteramente en manos de los propietarios.</w:t>
+      </w:r>
+    </w:p>
+    <w:p>
+      <w:pPr>
+        <w:pBdr>
+          <w:bottom w:val="single" w:color="D9D6CF" w:sz="6"/>
+        </w:pBdr>
+        <w:spacing w:after="200" w:before="100"/>
+      </w:pPr>
+    </w:p>
+    <w:p>
+      <w:pPr>
+        <w:pStyle w:val="Heading1"/>
+        <w:spacing w:after="200" w:before="400"/>
+      </w:pPr>
+      <w:r>
+        <w:rPr>
+          <w:rFonts w:ascii="Cambria" w:cs="Cambria" w:eastAsia="Cambria" w:hAnsi="Cambria"/>
+          <w:b/>
+          <w:bCs/>
+          <w:color w:val="1C1F26"/>
+          <w:sz w:val="30"/>
+          <w:szCs w:val="30"/>
+        </w:rPr>
+        <w:t xml:space="preserve">3. El activo (base de la comunicación de campaña)</w:t>
       </w:r>
     </w:p>
     <w:tbl>
@@ -707,7 +1028,7 @@
           <w:sz w:val="21"/>
           <w:szCs w:val="21"/>
         </w:rPr>
-        <w:t xml:space="preserve">Nota importante: en todo material de marketing, la facturación debe presentarse siempre como cifra bruta. No se dispone de cifras de rentabilidad neta (gastos operativos, administración, impuestos), por lo que no debe comunicarse ni insinuarse un retorno neto específico al comprador.</w:t>
+        <w:t xml:space="preserve">Nota importante: en todo material de campaña, la facturación debe presentarse siempre como cifra bruta. No debe comunicarse ni insinuarse un retorno neto específico al interesado.</w:t>
       </w:r>
     </w:p>
     <w:p>
@@ -732,7 +1053,7 @@
           <w:sz w:val="30"/>
           <w:szCs w:val="30"/>
         </w:rPr>
-        <w:t xml:space="preserve">3. Consideraciones legales</w:t>
+        <w:t xml:space="preserve">4. Objetivo de mi gestión y perfil de comprador</w:t>
       </w:r>
     </w:p>
     <w:p>
@@ -746,7 +1067,7 @@
           <w:sz w:val="21"/>
           <w:szCs w:val="21"/>
         </w:rPr>
-        <w:t xml:space="preserve">Existen dos frentes legales que deben avanzar en paralelo al proceso comercial. Ninguno de los dos detiene el lanzamiento de la campaña, pero ambos deben tener claridad de plazos antes de comprometerse con un comprador en la etapa de negociación.</w:t>
+        <w:t xml:space="preserve">Objetivo: generar y entregar a los propietarios interesados calificados con capacidad de compra total del activo, en un plazo objetivo de 3 meses, con apertura a extender la gestión si se requiere.</w:t>
       </w:r>
     </w:p>
     <w:p>
@@ -763,69 +1084,7 @@
           <w:sz w:val="24"/>
           <w:szCs w:val="24"/>
         </w:rPr>
-        <w:t xml:space="preserve">3.1 Hipoteca vigente</w:t>
-      </w:r>
-    </w:p>
-    <w:p>
-      <w:pPr>
-        <w:spacing w:after="140"/>
-      </w:pPr>
-      <w:r>
-        <w:rPr>
-          <w:rFonts w:ascii="Calibri" w:cs="Calibri" w:eastAsia="Calibri" w:hAnsi="Calibri"/>
-          <w:color w:val="222222"/>
-          <w:sz w:val="21"/>
-          <w:szCs w:val="21"/>
-        </w:rPr>
-        <w:t xml:space="preserve">El inmueble tiene una hipoteca activa a nombre de la sociedad propietaria. Debe definirse con anticipación, junto con el abogado de los propietarios, si esta se cancela antes del cierre o si se estructura como parte del precio de venta (asunción de deuda, descuento del saldo, etc.).</w:t>
-      </w:r>
-    </w:p>
-    <w:p>
-      <w:pPr>
-        <w:pStyle w:val="Heading2"/>
-        <w:spacing w:after="140" w:before="300"/>
-      </w:pPr>
-      <w:r>
-        <w:rPr>
-          <w:rFonts w:ascii="Calibri" w:cs="Calibri" w:eastAsia="Calibri" w:hAnsi="Calibri"/>
-          <w:b/>
-          <w:bCs/>
-          <w:color w:val="B08D57"/>
-          <w:sz w:val="24"/>
-          <w:szCs w:val="24"/>
-        </w:rPr>
-        <w:t xml:space="preserve">3.2 Proceso de sucesión</w:t>
-      </w:r>
-    </w:p>
-    <w:p>
-      <w:pPr>
-        <w:spacing w:after="140"/>
-      </w:pPr>
-      <w:r>
-        <w:rPr>
-          <w:rFonts w:ascii="Calibri" w:cs="Calibri" w:eastAsia="Calibri" w:hAnsi="Calibri"/>
-          <w:color w:val="222222"/>
-          <w:sz w:val="21"/>
-          <w:szCs w:val="21"/>
-        </w:rPr>
-        <w:t xml:space="preserve">Un porcentaje de la participación societaria (no la totalidad) está sujeto a un proceso de sucesión en curso. Se recomienda confirmar con el abogado de los propietarios un cronograma estimado de resolución. Si no existe una fecha clara, se debe ajustar la expectativa de cierre con cualquier comprador avanzado antes de firmar compromisos vinculantes.</w:t>
-      </w:r>
-    </w:p>
-    <w:p>
-      <w:pPr>
-        <w:pStyle w:val="Heading2"/>
-        <w:spacing w:after="140" w:before="300"/>
-      </w:pPr>
-      <w:r>
-        <w:rPr>
-          <w:rFonts w:ascii="Calibri" w:cs="Calibri" w:eastAsia="Calibri" w:hAnsi="Calibri"/>
-          <w:b/>
-          <w:bCs/>
-          <w:color w:val="B08D57"/>
-          <w:sz w:val="24"/>
-          <w:szCs w:val="24"/>
-        </w:rPr>
-        <w:t xml:space="preserve">3.3 Manejo de esta información frente al mercado</w:t>
+        <w:t xml:space="preserve">Perfiles objetivo de la segmentación (cualquiera de los siguientes, sin exclusión)</w:t>
       </w:r>
     </w:p>
     <w:p>
@@ -844,7 +1103,7 @@
           <w:sz w:val="21"/>
           <w:szCs w:val="21"/>
         </w:rPr>
-        <w:t xml:space="preserve">Nunca se menciona la hipoteca ni la sucesión en el teaser público ni en los anuncios de Meta Ads.</w:t>
+        <w:t xml:space="preserve">Fondos inmobiliarios</w:t>
       </w:r>
     </w:p>
     <w:p>
@@ -863,7 +1122,7 @@
           <w:sz w:val="21"/>
           <w:szCs w:val="21"/>
         </w:rPr>
-        <w:t xml:space="preserve">Se revela únicamente en el dossier confidencial, después de que el interesado firme el NDA.</w:t>
+        <w:t xml:space="preserve">Operadores hoteleros o de renta corta que busquen escalar</w:t>
       </w:r>
     </w:p>
     <w:p>
@@ -882,7 +1141,59 @@
           <w:sz w:val="21"/>
           <w:szCs w:val="21"/>
         </w:rPr>
-        <w:t xml:space="preserve">Se presenta con transparencia y en términos neutros: como parte de la estructura legal de la sociedad, no como un problema.</w:t>
+        <w:t xml:space="preserve">Family offices</w:t>
+      </w:r>
+    </w:p>
+    <w:p>
+      <w:pPr>
+        <w:pStyle w:val="ListParagraph"/>
+        <w:numPr>
+          <w:ilvl w:val="0"/>
+          <w:numId w:val="2"/>
+        </w:numPr>
+        <w:spacing w:after="90"/>
+      </w:pPr>
+      <w:r>
+        <w:rPr>
+          <w:rFonts w:ascii="Calibri" w:cs="Calibri" w:eastAsia="Calibri" w:hAnsi="Calibri"/>
+          <w:color w:val="222222"/>
+          <w:sz w:val="21"/>
+          <w:szCs w:val="21"/>
+        </w:rPr>
+        <w:t xml:space="preserve">Inversionistas extranjeros</w:t>
+      </w:r>
+    </w:p>
+    <w:p>
+      <w:pPr>
+        <w:pStyle w:val="ListParagraph"/>
+        <w:numPr>
+          <w:ilvl w:val="0"/>
+          <w:numId w:val="2"/>
+        </w:numPr>
+        <w:spacing w:after="90"/>
+      </w:pPr>
+      <w:r>
+        <w:rPr>
+          <w:rFonts w:ascii="Calibri" w:cs="Calibri" w:eastAsia="Calibri" w:hAnsi="Calibri"/>
+          <w:color w:val="222222"/>
+          <w:sz w:val="21"/>
+          <w:szCs w:val="21"/>
+        </w:rPr>
+        <w:t xml:space="preserve">Interesados en convertir el edificio a propiedad horizontal a futuro</w:t>
+      </w:r>
+    </w:p>
+    <w:p>
+      <w:pPr>
+        <w:spacing w:after="140"/>
+      </w:pPr>
+      <w:r>
+        <w:rPr>
+          <w:rFonts w:ascii="Calibri" w:cs="Calibri" w:eastAsia="Calibri" w:hAnsi="Calibri"/>
+          <w:color w:val="222222"/>
+          <w:sz w:val="21"/>
+          <w:szCs w:val="21"/>
+        </w:rPr>
+        <w:t xml:space="preserve">El filtro determinante no es el tipo de interesado, sino su capacidad real de compra total del activo ($4.000.000.000), evaluada a través del formulario de calificación.</w:t>
       </w:r>
     </w:p>
     <w:p>
@@ -907,186 +1218,7 @@
           <w:sz w:val="30"/>
           <w:szCs w:val="30"/>
         </w:rPr>
-        <w:t xml:space="preserve">4. Objetivo del plan y perfil de comprador</w:t>
-      </w:r>
-    </w:p>
-    <w:p>
-      <w:pPr>
-        <w:spacing w:after="140"/>
-      </w:pPr>
-      <w:r>
-        <w:rPr>
-          <w:rFonts w:ascii="Calibri" w:cs="Calibri" w:eastAsia="Calibri" w:hAnsi="Calibri"/>
-          <w:color w:val="222222"/>
-          <w:sz w:val="21"/>
-          <w:szCs w:val="21"/>
-        </w:rPr>
-        <w:t xml:space="preserve">Objetivo: identificar, calificar y cerrar la venta de Hosty56 con un único comprador (persona natural, sociedad o consorcio) en un plazo objetivo de 3 meses, con apertura a extender el plazo si el proceso lo requiere.</w:t>
-      </w:r>
-    </w:p>
-    <w:p>
-      <w:pPr>
-        <w:pStyle w:val="Heading2"/>
-        <w:spacing w:after="140" w:before="300"/>
-      </w:pPr>
-      <w:r>
-        <w:rPr>
-          <w:rFonts w:ascii="Calibri" w:cs="Calibri" w:eastAsia="Calibri" w:hAnsi="Calibri"/>
-          <w:b/>
-          <w:bCs/>
-          <w:color w:val="B08D57"/>
-          <w:sz w:val="24"/>
-          <w:szCs w:val="24"/>
-        </w:rPr>
-        <w:t xml:space="preserve">Perfiles de comprador objetivo (cualquiera de los siguientes, sin exclusión)</w:t>
-      </w:r>
-    </w:p>
-    <w:p>
-      <w:pPr>
-        <w:pStyle w:val="ListParagraph"/>
-        <w:numPr>
-          <w:ilvl w:val="0"/>
-          <w:numId w:val="2"/>
-        </w:numPr>
-        <w:spacing w:after="90"/>
-      </w:pPr>
-      <w:r>
-        <w:rPr>
-          <w:rFonts w:ascii="Calibri" w:cs="Calibri" w:eastAsia="Calibri" w:hAnsi="Calibri"/>
-          <w:color w:val="222222"/>
-          <w:sz w:val="21"/>
-          <w:szCs w:val="21"/>
-        </w:rPr>
-        <w:t xml:space="preserve">Fondos inmobiliarios</w:t>
-      </w:r>
-    </w:p>
-    <w:p>
-      <w:pPr>
-        <w:pStyle w:val="ListParagraph"/>
-        <w:numPr>
-          <w:ilvl w:val="0"/>
-          <w:numId w:val="2"/>
-        </w:numPr>
-        <w:spacing w:after="90"/>
-      </w:pPr>
-      <w:r>
-        <w:rPr>
-          <w:rFonts w:ascii="Calibri" w:cs="Calibri" w:eastAsia="Calibri" w:hAnsi="Calibri"/>
-          <w:color w:val="222222"/>
-          <w:sz w:val="21"/>
-          <w:szCs w:val="21"/>
-        </w:rPr>
-        <w:t xml:space="preserve">Operadores hoteleros o de renta corta que busquen escalar</w:t>
-      </w:r>
-    </w:p>
-    <w:p>
-      <w:pPr>
-        <w:pStyle w:val="ListParagraph"/>
-        <w:numPr>
-          <w:ilvl w:val="0"/>
-          <w:numId w:val="2"/>
-        </w:numPr>
-        <w:spacing w:after="90"/>
-      </w:pPr>
-      <w:r>
-        <w:rPr>
-          <w:rFonts w:ascii="Calibri" w:cs="Calibri" w:eastAsia="Calibri" w:hAnsi="Calibri"/>
-          <w:color w:val="222222"/>
-          <w:sz w:val="21"/>
-          <w:szCs w:val="21"/>
-        </w:rPr>
-        <w:t xml:space="preserve">Family offices</w:t>
-      </w:r>
-    </w:p>
-    <w:p>
-      <w:pPr>
-        <w:pStyle w:val="ListParagraph"/>
-        <w:numPr>
-          <w:ilvl w:val="0"/>
-          <w:numId w:val="2"/>
-        </w:numPr>
-        <w:spacing w:after="90"/>
-      </w:pPr>
-      <w:r>
-        <w:rPr>
-          <w:rFonts w:ascii="Calibri" w:cs="Calibri" w:eastAsia="Calibri" w:hAnsi="Calibri"/>
-          <w:color w:val="222222"/>
-          <w:sz w:val="21"/>
-          <w:szCs w:val="21"/>
-        </w:rPr>
-        <w:t xml:space="preserve">Inversionistas extranjeros</w:t>
-      </w:r>
-    </w:p>
-    <w:p>
-      <w:pPr>
-        <w:pStyle w:val="ListParagraph"/>
-        <w:numPr>
-          <w:ilvl w:val="0"/>
-          <w:numId w:val="2"/>
-        </w:numPr>
-        <w:spacing w:after="90"/>
-      </w:pPr>
-      <w:r>
-        <w:rPr>
-          <w:rFonts w:ascii="Calibri" w:cs="Calibri" w:eastAsia="Calibri" w:hAnsi="Calibri"/>
-          <w:color w:val="222222"/>
-          <w:sz w:val="21"/>
-          <w:szCs w:val="21"/>
-        </w:rPr>
-        <w:t xml:space="preserve">Interesados en convertir el edificio a propiedad horizontal a futuro</w:t>
-      </w:r>
-    </w:p>
-    <w:p>
-      <w:pPr>
-        <w:spacing w:after="140"/>
-      </w:pPr>
-      <w:r>
-        <w:rPr>
-          <w:rFonts w:ascii="Calibri" w:cs="Calibri" w:eastAsia="Calibri" w:hAnsi="Calibri"/>
-          <w:color w:val="222222"/>
-          <w:sz w:val="21"/>
-          <w:szCs w:val="21"/>
-        </w:rPr>
-        <w:t xml:space="preserve">El filtro determinante no es el tipo de comprador, sino su capacidad real de compra total del activo ($4.000.000.000).</w:t>
-      </w:r>
-    </w:p>
-    <w:p>
-      <w:pPr>
-        <w:pBdr>
-          <w:bottom w:val="single" w:color="D9D6CF" w:sz="6"/>
-        </w:pBdr>
-        <w:spacing w:after="200" w:before="100"/>
-      </w:pPr>
-    </w:p>
-    <w:p>
-      <w:pPr>
-        <w:pStyle w:val="Heading1"/>
-        <w:spacing w:after="200" w:before="400"/>
-      </w:pPr>
-      <w:r>
-        <w:rPr>
-          <w:rFonts w:ascii="Cambria" w:cs="Cambria" w:eastAsia="Cambria" w:hAnsi="Cambria"/>
-          <w:b/>
-          <w:bCs/>
-          <w:color w:val="1C1F26"/>
-          <w:sz w:val="30"/>
-          <w:szCs w:val="30"/>
-        </w:rPr>
-        <w:t xml:space="preserve">5. Estrategia general: cuatro etapas</w:t>
-      </w:r>
-    </w:p>
-    <w:p>
-      <w:pPr>
-        <w:spacing w:after="140"/>
-      </w:pPr>
-      <w:r>
-        <w:rPr>
-          <w:rFonts w:ascii="Calibri" w:cs="Calibri" w:eastAsia="Calibri" w:hAnsi="Calibri"/>
-          <w:color w:val="222222"/>
-          <w:sz w:val="21"/>
-          <w:szCs w:val="21"/>
-        </w:rPr>
-        <w:t xml:space="preserve">El proceso reemplaza la lógica de un embudo de ventas de producto recurrente por una de venta de activo único: cada etapa filtra al público hasta llegar a un comprador calificado.</w:t>
+        <w:t xml:space="preserve">5. La estrategia digital: tres etapas</w:t>
       </w:r>
     </w:p>
     <w:tbl>
@@ -1231,7 +1363,7 @@
                 <w:sz w:val="20"/>
                 <w:szCs w:val="20"/>
               </w:rPr>
-              <w:t xml:space="preserve">2. Calificación con NDA</w:t>
+              <w:t xml:space="preserve">2. Calificación digital</w:t>
             </w:r>
           </w:p>
         </w:tc>
@@ -1256,7 +1388,7 @@
                 <w:sz w:val="20"/>
                 <w:szCs w:val="20"/>
               </w:rPr>
-              <w:t xml:space="preserve">Filtrar curiosos: solo quien califica y firma NDA recibe el dossier completo.</w:t>
+              <w:t xml:space="preserve">Filtrar curiosos automáticamente mediante landing y formulario, antes de generar el contacto.</w:t>
             </w:r>
           </w:p>
         </w:tc>
@@ -1283,7 +1415,7 @@
                 <w:sz w:val="20"/>
                 <w:szCs w:val="20"/>
               </w:rPr>
-              <w:t xml:space="preserve">3. Llamada de interés</w:t>
+              <w:t xml:space="preserve">3. Entrega de interesados</w:t>
             </w:r>
           </w:p>
         </w:tc>
@@ -1308,59 +1440,7 @@
                 <w:sz w:val="20"/>
                 <w:szCs w:val="20"/>
               </w:rPr>
-              <w:t xml:space="preserve">Confirmar capacidad financiera real e interés serio antes de agendar visita.</w:t>
-            </w:r>
-          </w:p>
-        </w:tc>
-      </w:tr>
-      <w:tr>
-        <w:tc>
-          <w:tcPr>
-            <w:tcW w:type="dxa" w:w="3400"/>
-            <w:shd w:fill="F4F3F1" w:val="clear"/>
-            <w:tcMar>
-              <w:top w:type="dxa" w:w="100"/>
-              <w:left w:type="dxa" w:w="150"/>
-              <w:bottom w:type="dxa" w:w="100"/>
-              <w:right w:type="dxa" w:w="150"/>
-            </w:tcMar>
-          </w:tcPr>
-          <w:p>
-            <w:r>
-              <w:rPr>
-                <w:rFonts w:ascii="Calibri" w:cs="Calibri" w:eastAsia="Calibri" w:hAnsi="Calibri"/>
-                <w:b w:val="false"/>
-                <w:bCs w:val="false"/>
-                <w:color w:val="222222"/>
-                <w:sz w:val="20"/>
-                <w:szCs w:val="20"/>
-              </w:rPr>
-              <w:t xml:space="preserve">4. Visita y negociación</w:t>
-            </w:r>
-          </w:p>
-        </w:tc>
-        <w:tc>
-          <w:tcPr>
-            <w:tcW w:type="dxa" w:w="5800"/>
-            <w:shd w:fill="F4F3F1" w:val="clear"/>
-            <w:tcMar>
-              <w:top w:type="dxa" w:w="100"/>
-              <w:left w:type="dxa" w:w="150"/>
-              <w:bottom w:type="dxa" w:w="100"/>
-              <w:right w:type="dxa" w:w="150"/>
-            </w:tcMar>
-          </w:tcPr>
-          <w:p>
-            <w:r>
-              <w:rPr>
-                <w:rFonts w:ascii="Calibri" w:cs="Calibri" w:eastAsia="Calibri" w:hAnsi="Calibri"/>
-                <w:b w:val="false"/>
-                <w:bCs w:val="false"/>
-                <w:color w:val="222222"/>
-                <w:sz w:val="20"/>
-                <w:szCs w:val="20"/>
-              </w:rPr>
-              <w:t xml:space="preserve">Solo compradores calificados visitan el edificio; de ahí a negociación directa.</w:t>
+              <w:t xml:space="preserve">Traspasar a los propietarios contactos reales, calificados, listos para que ellos avancen.</w:t>
             </w:r>
           </w:p>
         </w:tc>
@@ -1385,7 +1465,7 @@
           <w:sz w:val="30"/>
           <w:szCs w:val="30"/>
         </w:rPr>
-        <w:t xml:space="preserve">6. Materiales necesarios</w:t>
+        <w:t xml:space="preserve">6. Materiales de la campaña digital</w:t>
       </w:r>
     </w:p>
     <w:p>
@@ -1563,7 +1643,7 @@
           <w:sz w:val="21"/>
           <w:szCs w:val="21"/>
         </w:rPr>
-        <w:t xml:space="preserve">Cualquier mención a la hipoteca o al proceso de sucesión</w:t>
+        <w:t xml:space="preserve">Cualquier mención a la hipoteca o al proceso de sucesión de la sociedad</w:t>
       </w:r>
     </w:p>
     <w:p>
@@ -1580,7 +1660,7 @@
           <w:sz w:val="24"/>
           <w:szCs w:val="24"/>
         </w:rPr>
-        <w:t xml:space="preserve">6.2 Landing de calificación</w:t>
+        <w:t xml:space="preserve">6.2 Landing y formulario de calificación</w:t>
       </w:r>
     </w:p>
     <w:p>
@@ -1594,7 +1674,7 @@
           <w:sz w:val="21"/>
           <w:szCs w:val="21"/>
         </w:rPr>
-        <w:t xml:space="preserve">Formulario que el interesado debe completar antes de continuar. Preguntas sugeridas:</w:t>
+        <w:t xml:space="preserve">Formulario que el interesado debe completar antes de ser registrado como interesado calificado. Preguntas sugeridas:</w:t>
       </w:r>
     </w:p>
     <w:p>
@@ -1689,7 +1769,7 @@
           <w:sz w:val="21"/>
           <w:szCs w:val="21"/>
         </w:rPr>
-        <w:t xml:space="preserve">¿En qué plazo estaría en capacidad de cerrar una compra de este tipo?</w:t>
+        <w:t xml:space="preserve">¿En qué plazo estaría en capacidad de avanzar en una compra de este tipo?</w:t>
       </w:r>
     </w:p>
     <w:p>
@@ -1725,7 +1805,7 @@
           <w:sz w:val="24"/>
           <w:szCs w:val="24"/>
         </w:rPr>
-        <w:t xml:space="preserve">6.3 NDA (acuerdo de confidencialidad)</w:t>
+        <w:t xml:space="preserve">6.3 Criterios de calificación automática</w:t>
       </w:r>
     </w:p>
     <w:p>
@@ -1739,7 +1819,7 @@
           <w:sz w:val="21"/>
           <w:szCs w:val="21"/>
         </w:rPr>
-        <w:t xml:space="preserve">Documento digital que el interesado firma antes de recibir el dossier. Debe cubrir, como mínimo:</w:t>
+        <w:t xml:space="preserve">Se considera interesado calificado a quien:</w:t>
       </w:r>
     </w:p>
     <w:p>
@@ -1758,7 +1838,7 @@
           <w:sz w:val="21"/>
           <w:szCs w:val="21"/>
         </w:rPr>
-        <w:t xml:space="preserve">Confidencialidad sobre la dirección, identidad de los propietarios y cifras financieras</w:t>
+        <w:t xml:space="preserve">Confirma capacidad de compra por el valor total o cercano al valor de venta</w:t>
       </w:r>
     </w:p>
     <w:p>
@@ -1777,7 +1857,7 @@
           <w:sz w:val="21"/>
           <w:szCs w:val="21"/>
         </w:rPr>
-        <w:t xml:space="preserve">Prohibición de contactar directamente a los propietarios, inquilinos o la operación sin pasar por el proceso definido</w:t>
+        <w:t xml:space="preserve">Identifica un perfil coherente con los perfiles objetivo (fondo, operador, family office, inversionista, o interés en conversión a PH)</w:t>
       </w:r>
     </w:p>
     <w:p>
@@ -1796,7 +1876,7 @@
           <w:sz w:val="21"/>
           <w:szCs w:val="21"/>
         </w:rPr>
-        <w:t xml:space="preserve">Vigencia del acuerdo y consecuencias de incumplimiento</w:t>
+        <w:t xml:space="preserve">Deja datos de contacto completos y verificables</w:t>
       </w:r>
     </w:p>
     <w:p>
@@ -1810,38 +1890,7 @@
           <w:sz w:val="21"/>
           <w:szCs w:val="21"/>
         </w:rPr>
-        <w:t xml:space="preserve">Se recomienda que este documento sea preparado o revisado por el abogado de los propietarios.</w:t>
-      </w:r>
-    </w:p>
-    <w:p>
-      <w:pPr>
-        <w:pStyle w:val="Heading2"/>
-        <w:spacing w:after="140" w:before="300"/>
-      </w:pPr>
-      <w:r>
-        <w:rPr>
-          <w:rFonts w:ascii="Calibri" w:cs="Calibri" w:eastAsia="Calibri" w:hAnsi="Calibri"/>
-          <w:b/>
-          <w:bCs/>
-          <w:color w:val="B08D57"/>
-          <w:sz w:val="24"/>
-          <w:szCs w:val="24"/>
-        </w:rPr>
-        <w:t xml:space="preserve">6.4 Dossier confidencial</w:t>
-      </w:r>
-    </w:p>
-    <w:p>
-      <w:pPr>
-        <w:spacing w:after="140"/>
-      </w:pPr>
-      <w:r>
-        <w:rPr>
-          <w:rFonts w:ascii="Calibri" w:cs="Calibri" w:eastAsia="Calibri" w:hAnsi="Calibri"/>
-          <w:color w:val="222222"/>
-          <w:sz w:val="21"/>
-          <w:szCs w:val="21"/>
-        </w:rPr>
-        <w:t xml:space="preserve">Se entrega únicamente después de la firma del NDA. Debe incluir:</w:t>
+        <w:t xml:space="preserve">No se considera calificado (no se traspasa a los propietarios) quien:</w:t>
       </w:r>
     </w:p>
     <w:p>
@@ -1860,7 +1909,7 @@
           <w:sz w:val="21"/>
           <w:szCs w:val="21"/>
         </w:rPr>
-        <w:t xml:space="preserve">Dirección exacta y fotografías del edificio</w:t>
+        <w:t xml:space="preserve">Evade o deja en blanco las preguntas de capacidad financiera</w:t>
       </w:r>
     </w:p>
     <w:p>
@@ -1879,7 +1928,7 @@
           <w:sz w:val="21"/>
           <w:szCs w:val="21"/>
         </w:rPr>
-        <w:t xml:space="preserve">Estados financieros de la operación (facturación bruta, ocupación, ingresos por unidad)</w:t>
+        <w:t xml:space="preserve">Manifiesta solo curiosidad general, sin intención concreta de avanzar</w:t>
       </w:r>
     </w:p>
     <w:p>
@@ -1898,7 +1947,46 @@
           <w:sz w:val="21"/>
           <w:szCs w:val="21"/>
         </w:rPr>
-        <w:t xml:space="preserve">Situación legal de la sociedad (incluyendo hipoteca y proceso de sucesión, explicados con claridad)</w:t>
+        <w:t xml:space="preserve">Pide la dirección exacta o el contacto directo con los propietarios antes de completar el formulario</w:t>
+      </w:r>
+    </w:p>
+    <w:p>
+      <w:pPr>
+        <w:pBdr>
+          <w:bottom w:val="single" w:color="D9D6CF" w:sz="6"/>
+        </w:pBdr>
+        <w:spacing w:after="200" w:before="100"/>
+      </w:pPr>
+    </w:p>
+    <w:p>
+      <w:pPr>
+        <w:pStyle w:val="Heading1"/>
+        <w:spacing w:after="200" w:before="400"/>
+      </w:pPr>
+      <w:r>
+        <w:rPr>
+          <w:rFonts w:ascii="Cambria" w:cs="Cambria" w:eastAsia="Cambria" w:hAnsi="Cambria"/>
+          <w:b/>
+          <w:bCs/>
+          <w:color w:val="1C1F26"/>
+          <w:sz w:val="30"/>
+          <w:szCs w:val="30"/>
+        </w:rPr>
+        <w:t xml:space="preserve">7. Protocolo de entrega de interesados calificados</w:t>
+      </w:r>
+    </w:p>
+    <w:p>
+      <w:pPr>
+        <w:spacing w:after="140"/>
+      </w:pPr>
+      <w:r>
+        <w:rPr>
+          <w:rFonts w:ascii="Calibri" w:cs="Calibri" w:eastAsia="Calibri" w:hAnsi="Calibri"/>
+          <w:color w:val="222222"/>
+          <w:sz w:val="21"/>
+          <w:szCs w:val="21"/>
+        </w:rPr>
+        <w:t xml:space="preserve">Cada interesado que pasa el filtro digital se entrega a los propietarios mediante un reporte simple y consistente, que incluye:</w:t>
       </w:r>
     </w:p>
     <w:p>
@@ -1917,7 +2005,78 @@
           <w:sz w:val="21"/>
           <w:szCs w:val="21"/>
         </w:rPr>
-        <w:t xml:space="preserve">Condiciones de venta esperadas (precio, forma de pago, plazos)</w:t>
+        <w:t xml:space="preserve">Nombre y datos de contacto</w:t>
+      </w:r>
+    </w:p>
+    <w:p>
+      <w:pPr>
+        <w:pStyle w:val="ListParagraph"/>
+        <w:numPr>
+          <w:ilvl w:val="0"/>
+          <w:numId w:val="2"/>
+        </w:numPr>
+        <w:spacing w:after="90"/>
+      </w:pPr>
+      <w:r>
+        <w:rPr>
+          <w:rFonts w:ascii="Calibri" w:cs="Calibri" w:eastAsia="Calibri" w:hAnsi="Calibri"/>
+          <w:color w:val="222222"/>
+          <w:sz w:val="21"/>
+          <w:szCs w:val="21"/>
+        </w:rPr>
+        <w:t xml:space="preserve">Respuestas completas del formulario de calificación</w:t>
+      </w:r>
+    </w:p>
+    <w:p>
+      <w:pPr>
+        <w:pStyle w:val="ListParagraph"/>
+        <w:numPr>
+          <w:ilvl w:val="0"/>
+          <w:numId w:val="2"/>
+        </w:numPr>
+        <w:spacing w:after="90"/>
+      </w:pPr>
+      <w:r>
+        <w:rPr>
+          <w:rFonts w:ascii="Calibri" w:cs="Calibri" w:eastAsia="Calibri" w:hAnsi="Calibri"/>
+          <w:color w:val="222222"/>
+          <w:sz w:val="21"/>
+          <w:szCs w:val="21"/>
+        </w:rPr>
+        <w:t xml:space="preserve">Perfil identificado (fondo, operador, family office, inversionista, interés en PH, otro)</w:t>
+      </w:r>
+    </w:p>
+    <w:p>
+      <w:pPr>
+        <w:pStyle w:val="ListParagraph"/>
+        <w:numPr>
+          <w:ilvl w:val="0"/>
+          <w:numId w:val="2"/>
+        </w:numPr>
+        <w:spacing w:after="90"/>
+      </w:pPr>
+      <w:r>
+        <w:rPr>
+          <w:rFonts w:ascii="Calibri" w:cs="Calibri" w:eastAsia="Calibri" w:hAnsi="Calibri"/>
+          <w:color w:val="222222"/>
+          <w:sz w:val="21"/>
+          <w:szCs w:val="21"/>
+        </w:rPr>
+        <w:t xml:space="preserve">Fecha y canal de origen del contacto</w:t>
+      </w:r>
+    </w:p>
+    <w:p>
+      <w:pPr>
+        <w:spacing w:after="140"/>
+      </w:pPr>
+      <w:r>
+        <w:rPr>
+          <w:rFonts w:ascii="Calibri" w:cs="Calibri" w:eastAsia="Calibri" w:hAnsi="Calibri"/>
+          <w:color w:val="222222"/>
+          <w:sz w:val="21"/>
+          <w:szCs w:val="21"/>
+        </w:rPr>
+        <w:t xml:space="preserve">A partir de este punto, los propietarios gestionan directamente el NDA, el dossier confidencial, la verificación adicional, la visita y la negociación. Mi gestión no incluye llamadas de verificación, coordinación de visitas ni participación en la negociación, salvo que los propietarios lo soliciten expresamente y se acuerde por separado.</w:t>
       </w:r>
     </w:p>
     <w:p>
@@ -1942,7 +2101,7 @@
           <w:sz w:val="30"/>
           <w:szCs w:val="30"/>
         </w:rPr>
-        <w:t xml:space="preserve">7. Guion de la llamada de interés</w:t>
+        <w:t xml:space="preserve">8. Fuera de mi alcance</w:t>
       </w:r>
     </w:p>
     <w:p>
@@ -1956,136 +2115,7 @@
           <w:sz w:val="21"/>
           <w:szCs w:val="21"/>
         </w:rPr>
-        <w:t xml:space="preserve">Objetivo de la llamada: confirmar en menos de 15 minutos que el interesado tiene capacidad e interés real, antes de invertir tiempo en agendar una visita presencial.</w:t>
-      </w:r>
-    </w:p>
-    <w:p>
-      <w:pPr>
-        <w:pStyle w:val="Heading2"/>
-        <w:spacing w:after="140" w:before="300"/>
-      </w:pPr>
-      <w:r>
-        <w:rPr>
-          <w:rFonts w:ascii="Calibri" w:cs="Calibri" w:eastAsia="Calibri" w:hAnsi="Calibri"/>
-          <w:b/>
-          <w:bCs/>
-          <w:color w:val="B08D57"/>
-          <w:sz w:val="24"/>
-          <w:szCs w:val="24"/>
-        </w:rPr>
-        <w:t xml:space="preserve">Preguntas clave</w:t>
-      </w:r>
-    </w:p>
-    <w:p>
-      <w:pPr>
-        <w:pStyle w:val="ListParagraph"/>
-        <w:numPr>
-          <w:ilvl w:val="0"/>
-          <w:numId w:val="4"/>
-        </w:numPr>
-        <w:spacing w:after="90"/>
-      </w:pPr>
-      <w:r>
-        <w:rPr>
-          <w:rFonts w:ascii="Calibri" w:cs="Calibri" w:eastAsia="Calibri" w:hAnsi="Calibri"/>
-          <w:color w:val="222222"/>
-          <w:sz w:val="21"/>
-          <w:szCs w:val="21"/>
-        </w:rPr>
-        <w:t xml:space="preserve">¿Nos puede confirmar en qué calidad estaría comprando: a nombre propio, de una sociedad, o de un fondo?</w:t>
-      </w:r>
-    </w:p>
-    <w:p>
-      <w:pPr>
-        <w:pStyle w:val="ListParagraph"/>
-        <w:numPr>
-          <w:ilvl w:val="0"/>
-          <w:numId w:val="4"/>
-        </w:numPr>
-        <w:spacing w:after="90"/>
-      </w:pPr>
-      <w:r>
-        <w:rPr>
-          <w:rFonts w:ascii="Calibri" w:cs="Calibri" w:eastAsia="Calibri" w:hAnsi="Calibri"/>
-          <w:color w:val="222222"/>
-          <w:sz w:val="21"/>
-          <w:szCs w:val="21"/>
-        </w:rPr>
-        <w:t xml:space="preserve">¿Cuenta hoy con los recursos o el respaldo financiero para una compra de este tamaño, o dependería de una gestión de crédito o de socios adicionales?</w:t>
-      </w:r>
-    </w:p>
-    <w:p>
-      <w:pPr>
-        <w:pStyle w:val="ListParagraph"/>
-        <w:numPr>
-          <w:ilvl w:val="0"/>
-          <w:numId w:val="4"/>
-        </w:numPr>
-        <w:spacing w:after="90"/>
-      </w:pPr>
-      <w:r>
-        <w:rPr>
-          <w:rFonts w:ascii="Calibri" w:cs="Calibri" w:eastAsia="Calibri" w:hAnsi="Calibri"/>
-          <w:color w:val="222222"/>
-          <w:sz w:val="21"/>
-          <w:szCs w:val="21"/>
-        </w:rPr>
-        <w:t xml:space="preserve">¿Qué le interesa hacer con el activo: continuar la operación de renta corta, convertirlo a propiedad horizontal, u otro uso?</w:t>
-      </w:r>
-    </w:p>
-    <w:p>
-      <w:pPr>
-        <w:pStyle w:val="ListParagraph"/>
-        <w:numPr>
-          <w:ilvl w:val="0"/>
-          <w:numId w:val="4"/>
-        </w:numPr>
-        <w:spacing w:after="90"/>
-      </w:pPr>
-      <w:r>
-        <w:rPr>
-          <w:rFonts w:ascii="Calibri" w:cs="Calibri" w:eastAsia="Calibri" w:hAnsi="Calibri"/>
-          <w:color w:val="222222"/>
-          <w:sz w:val="21"/>
-          <w:szCs w:val="21"/>
-        </w:rPr>
-        <w:t xml:space="preserve">¿En qué plazo le gustaría avanzar, en caso de que la visita y la información confirmen su interés?</w:t>
-      </w:r>
-    </w:p>
-    <w:p>
-      <w:pPr>
-        <w:pStyle w:val="ListParagraph"/>
-        <w:numPr>
-          <w:ilvl w:val="0"/>
-          <w:numId w:val="4"/>
-        </w:numPr>
-        <w:spacing w:after="90"/>
-      </w:pPr>
-      <w:r>
-        <w:rPr>
-          <w:rFonts w:ascii="Calibri" w:cs="Calibri" w:eastAsia="Calibri" w:hAnsi="Calibri"/>
-          <w:color w:val="222222"/>
-          <w:sz w:val="21"/>
-          <w:szCs w:val="21"/>
-        </w:rPr>
-        <w:t xml:space="preserve">¿Tiene alguna pregunta antes de agendar la visita?</w:t>
-      </w:r>
-    </w:p>
-    <w:p>
-      <w:pPr>
-        <w:pStyle w:val="Heading2"/>
-        <w:spacing w:after="140" w:before="300"/>
-      </w:pPr>
-      <w:r>
-        <w:rPr>
-          <w:rFonts w:ascii="Calibri" w:cs="Calibri" w:eastAsia="Calibri" w:hAnsi="Calibri"/>
-          <w:b/>
-          <w:bCs/>
-          <w:color w:val="B08D57"/>
-          <w:sz w:val="24"/>
-          <w:szCs w:val="24"/>
-        </w:rPr>
-        <w:t xml:space="preserve">Señales de alerta (no agendar visita todavía)</w:t>
+        <w:t xml:space="preserve">Para evitar cualquier expectativa fuera de lo acordado, quedan explícitamente fuera de esta gestión:</w:t>
       </w:r>
     </w:p>
     <w:p>
@@ -2104,7 +2134,7 @@
           <w:sz w:val="21"/>
           <w:szCs w:val="21"/>
         </w:rPr>
-        <w:t xml:space="preserve">Evade responder sobre capacidad financiera o respaldo real</w:t>
+        <w:t xml:space="preserve">NDA y entrega del dossier confidencial</w:t>
       </w:r>
     </w:p>
     <w:p>
@@ -2123,7 +2153,7 @@
           <w:sz w:val="21"/>
           <w:szCs w:val="21"/>
         </w:rPr>
-        <w:t xml:space="preserve">Solo busca información general, sin intención concreta de avanzar</w:t>
+        <w:t xml:space="preserve">Llamadas de verificación y visitas presenciales al edificio</w:t>
       </w:r>
     </w:p>
     <w:p>
@@ -2142,7 +2172,7 @@
           <w:sz w:val="21"/>
           <w:szCs w:val="21"/>
         </w:rPr>
-        <w:t xml:space="preserve">Pide la dirección exacta o contacto directo con los propietarios antes de completar el proceso</w:t>
+        <w:t xml:space="preserve">Negociación, estructura de la oferta y cierre de la venta</w:t>
       </w:r>
     </w:p>
     <w:p>
@@ -2161,7 +2191,21 @@
           <w:sz w:val="21"/>
           <w:szCs w:val="21"/>
         </w:rPr>
-        <w:t xml:space="preserve">Presiona por descuentos o condiciones antes de conocer el activo</w:t>
+        <w:t xml:space="preserve">Aspectos legales de la sociedad</w:t>
+      </w:r>
+    </w:p>
+    <w:p>
+      <w:pPr>
+        <w:spacing w:after="140"/>
+      </w:pPr>
+      <w:r>
+        <w:rPr>
+          <w:rFonts w:ascii="Calibri" w:cs="Calibri" w:eastAsia="Calibri" w:hAnsi="Calibri"/>
+          <w:color w:val="222222"/>
+          <w:sz w:val="21"/>
+          <w:szCs w:val="21"/>
+        </w:rPr>
+        <w:t xml:space="preserve">Sobre este último punto: la sociedad propietaria tiene una hipoteca vigente sobre el inmueble, y un porcentaje de la participación societaria (no la totalidad) está sujeto a un proceso de sucesión en curso. Esta información es relevante para el proceso de venta, pero su resolución y manejo corresponde directamente a los propietarios y su abogado — no a esta gestión digital. Se recomienda que los propietarios confirmen con su abogado un cronograma estimado de resolución, para ajustar expectativas con cualquier interesado avanzado.</w:t>
       </w:r>
     </w:p>
     <w:p>
@@ -2186,103 +2230,238 @@
           <w:sz w:val="30"/>
           <w:szCs w:val="30"/>
         </w:rPr>
-        <w:t xml:space="preserve">8. Protocolo de visita presencial</w:t>
-      </w:r>
-    </w:p>
-    <w:p>
-      <w:pPr>
-        <w:pStyle w:val="ListParagraph"/>
-        <w:numPr>
-          <w:ilvl w:val="0"/>
-          <w:numId w:val="2"/>
-        </w:numPr>
-        <w:spacing w:after="90"/>
-      </w:pPr>
-      <w:r>
-        <w:rPr>
-          <w:rFonts w:ascii="Calibri" w:cs="Calibri" w:eastAsia="Calibri" w:hAnsi="Calibri"/>
-          <w:color w:val="222222"/>
-          <w:sz w:val="21"/>
-          <w:szCs w:val="21"/>
-        </w:rPr>
-        <w:t xml:space="preserve">Solo se agenda visita a quien pasó la llamada de interés.</w:t>
-      </w:r>
-    </w:p>
-    <w:p>
-      <w:pPr>
-        <w:pStyle w:val="ListParagraph"/>
-        <w:numPr>
-          <w:ilvl w:val="0"/>
-          <w:numId w:val="2"/>
-        </w:numPr>
-        <w:spacing w:after="90"/>
-      </w:pPr>
-      <w:r>
-        <w:rPr>
-          <w:rFonts w:ascii="Calibri" w:cs="Calibri" w:eastAsia="Calibri" w:hAnsi="Calibri"/>
-          <w:color w:val="222222"/>
-          <w:sz w:val="21"/>
-          <w:szCs w:val="21"/>
-        </w:rPr>
-        <w:t xml:space="preserve">La visita se coordina con los propietarios con al menos 48 horas de anticipación.</w:t>
-      </w:r>
-    </w:p>
-    <w:p>
-      <w:pPr>
-        <w:pStyle w:val="ListParagraph"/>
-        <w:numPr>
-          <w:ilvl w:val="0"/>
-          <w:numId w:val="2"/>
-        </w:numPr>
-        <w:spacing w:after="90"/>
-      </w:pPr>
-      <w:r>
-        <w:rPr>
-          <w:rFonts w:ascii="Calibri" w:cs="Calibri" w:eastAsia="Calibri" w:hAnsi="Calibri"/>
-          <w:color w:val="222222"/>
-          <w:sz w:val="21"/>
-          <w:szCs w:val="21"/>
-        </w:rPr>
-        <w:t xml:space="preserve">Se acompaña al interesado durante todo el recorrido; no se le deja acceso libre al edificio.</w:t>
-      </w:r>
-    </w:p>
-    <w:p>
-      <w:pPr>
-        <w:pStyle w:val="ListParagraph"/>
-        <w:numPr>
-          <w:ilvl w:val="0"/>
-          <w:numId w:val="2"/>
-        </w:numPr>
-        <w:spacing w:after="90"/>
-      </w:pPr>
-      <w:r>
-        <w:rPr>
-          <w:rFonts w:ascii="Calibri" w:cs="Calibri" w:eastAsia="Calibri" w:hAnsi="Calibri"/>
-          <w:color w:val="222222"/>
-          <w:sz w:val="21"/>
-          <w:szCs w:val="21"/>
-        </w:rPr>
-        <w:t xml:space="preserve">Al finalizar, se pregunta directamente por el nivel de interés y los siguientes pasos que espera el interesado.</w:t>
-      </w:r>
-    </w:p>
-    <w:p>
-      <w:pPr>
-        <w:pStyle w:val="ListParagraph"/>
-        <w:numPr>
-          <w:ilvl w:val="0"/>
-          <w:numId w:val="2"/>
-        </w:numPr>
-        <w:spacing w:after="90"/>
-      </w:pPr>
-      <w:r>
-        <w:rPr>
-          <w:rFonts w:ascii="Calibri" w:cs="Calibri" w:eastAsia="Calibri" w:hAnsi="Calibri"/>
-          <w:color w:val="222222"/>
-          <w:sz w:val="21"/>
-          <w:szCs w:val="21"/>
-        </w:rPr>
-        <w:t xml:space="preserve">Toda visita se registra (fecha, interesado, nivel de interés observado) para dar seguimiento.</w:t>
-      </w:r>
+        <w:t xml:space="preserve">9. Plan de campaña mes a mes</w:t>
+      </w:r>
+    </w:p>
+    <w:tbl>
+      <w:tblPr>
+        <w:tblW w:type="dxa" w:w="9200"/>
+        <w:tblBorders>
+          <w:top w:val="single" w:color="auto" w:sz="4"/>
+          <w:left w:val="single" w:color="auto" w:sz="4"/>
+          <w:bottom w:val="single" w:color="auto" w:sz="4"/>
+          <w:right w:val="single" w:color="auto" w:sz="4"/>
+          <w:insideH w:val="single" w:color="auto" w:sz="4"/>
+          <w:insideV w:val="single" w:color="auto" w:sz="4"/>
+        </w:tblBorders>
+      </w:tblPr>
+      <w:tblGrid>
+        <w:gridCol w:w="3400"/>
+        <w:gridCol w:w="5800"/>
+      </w:tblGrid>
+      <w:tr>
+        <w:tc>
+          <w:tcPr>
+            <w:tcW w:type="dxa" w:w="3400"/>
+            <w:shd w:fill="1C1F26" w:val="clear"/>
+            <w:tcMar>
+              <w:top w:type="dxa" w:w="100"/>
+              <w:left w:type="dxa" w:w="150"/>
+              <w:bottom w:type="dxa" w:w="100"/>
+              <w:right w:type="dxa" w:w="150"/>
+            </w:tcMar>
+          </w:tcPr>
+          <w:p>
+            <w:r>
+              <w:rPr>
+                <w:rFonts w:ascii="Calibri" w:cs="Calibri" w:eastAsia="Calibri" w:hAnsi="Calibri"/>
+                <w:b/>
+                <w:bCs/>
+                <w:color w:val="FFFFFF"/>
+                <w:sz w:val="20"/>
+                <w:szCs w:val="20"/>
+              </w:rPr>
+              <w:t xml:space="preserve">Mes</w:t>
+            </w:r>
+          </w:p>
+        </w:tc>
+        <w:tc>
+          <w:tcPr>
+            <w:tcW w:type="dxa" w:w="5800"/>
+            <w:shd w:fill="1C1F26" w:val="clear"/>
+            <w:tcMar>
+              <w:top w:type="dxa" w:w="100"/>
+              <w:left w:type="dxa" w:w="150"/>
+              <w:bottom w:type="dxa" w:w="100"/>
+              <w:right w:type="dxa" w:w="150"/>
+            </w:tcMar>
+          </w:tcPr>
+          <w:p>
+            <w:r>
+              <w:rPr>
+                <w:rFonts w:ascii="Calibri" w:cs="Calibri" w:eastAsia="Calibri" w:hAnsi="Calibri"/>
+                <w:b/>
+                <w:bCs/>
+                <w:color w:val="FFFFFF"/>
+                <w:sz w:val="20"/>
+                <w:szCs w:val="20"/>
+              </w:rPr>
+              <w:t xml:space="preserve">Enfoque</w:t>
+            </w:r>
+          </w:p>
+        </w:tc>
+      </w:tr>
+      <w:tr>
+        <w:tc>
+          <w:tcPr>
+            <w:tcW w:type="dxa" w:w="3400"/>
+            <w:shd w:fill="FFFFFF" w:val="clear"/>
+            <w:tcMar>
+              <w:top w:type="dxa" w:w="100"/>
+              <w:left w:type="dxa" w:w="150"/>
+              <w:bottom w:type="dxa" w:w="100"/>
+              <w:right w:type="dxa" w:w="150"/>
+            </w:tcMar>
+          </w:tcPr>
+          <w:p>
+            <w:r>
+              <w:rPr>
+                <w:rFonts w:ascii="Calibri" w:cs="Calibri" w:eastAsia="Calibri" w:hAnsi="Calibri"/>
+                <w:b w:val="false"/>
+                <w:bCs w:val="false"/>
+                <w:color w:val="222222"/>
+                <w:sz w:val="20"/>
+                <w:szCs w:val="20"/>
+              </w:rPr>
+              <w:t xml:space="preserve">Mes 1 — Preparación y lanzamiento</w:t>
+            </w:r>
+          </w:p>
+        </w:tc>
+        <w:tc>
+          <w:tcPr>
+            <w:tcW w:type="dxa" w:w="5800"/>
+            <w:shd w:fill="FFFFFF" w:val="clear"/>
+            <w:tcMar>
+              <w:top w:type="dxa" w:w="100"/>
+              <w:left w:type="dxa" w:w="150"/>
+              <w:bottom w:type="dxa" w:w="100"/>
+              <w:right w:type="dxa" w:w="150"/>
+            </w:tcMar>
+          </w:tcPr>
+          <w:p>
+            <w:r>
+              <w:rPr>
+                <w:rFonts w:ascii="Calibri" w:cs="Calibri" w:eastAsia="Calibri" w:hAnsi="Calibri"/>
+                <w:b w:val="false"/>
+                <w:bCs w:val="false"/>
+                <w:color w:val="222222"/>
+                <w:sz w:val="20"/>
+                <w:szCs w:val="20"/>
+              </w:rPr>
+              <w:t xml:space="preserve">Teaser, landing y formulario listos; lanzamiento de la difusión discreta; primeras entregas de interesados calificados.</w:t>
+            </w:r>
+          </w:p>
+        </w:tc>
+      </w:tr>
+      <w:tr>
+        <w:tc>
+          <w:tcPr>
+            <w:tcW w:type="dxa" w:w="3400"/>
+            <w:shd w:fill="F4F3F1" w:val="clear"/>
+            <w:tcMar>
+              <w:top w:type="dxa" w:w="100"/>
+              <w:left w:type="dxa" w:w="150"/>
+              <w:bottom w:type="dxa" w:w="100"/>
+              <w:right w:type="dxa" w:w="150"/>
+            </w:tcMar>
+          </w:tcPr>
+          <w:p>
+            <w:r>
+              <w:rPr>
+                <w:rFonts w:ascii="Calibri" w:cs="Calibri" w:eastAsia="Calibri" w:hAnsi="Calibri"/>
+                <w:b w:val="false"/>
+                <w:bCs w:val="false"/>
+                <w:color w:val="222222"/>
+                <w:sz w:val="20"/>
+                <w:szCs w:val="20"/>
+              </w:rPr>
+              <w:t xml:space="preserve">Mes 2 — Optimización</w:t>
+            </w:r>
+          </w:p>
+        </w:tc>
+        <w:tc>
+          <w:tcPr>
+            <w:tcW w:type="dxa" w:w="5800"/>
+            <w:shd w:fill="F4F3F1" w:val="clear"/>
+            <w:tcMar>
+              <w:top w:type="dxa" w:w="100"/>
+              <w:left w:type="dxa" w:w="150"/>
+              <w:bottom w:type="dxa" w:w="100"/>
+              <w:right w:type="dxa" w:w="150"/>
+            </w:tcMar>
+          </w:tcPr>
+          <w:p>
+            <w:r>
+              <w:rPr>
+                <w:rFonts w:ascii="Calibri" w:cs="Calibri" w:eastAsia="Calibri" w:hAnsi="Calibri"/>
+                <w:b w:val="false"/>
+                <w:bCs w:val="false"/>
+                <w:color w:val="222222"/>
+                <w:sz w:val="20"/>
+                <w:szCs w:val="20"/>
+              </w:rPr>
+              <w:t xml:space="preserve">Ajuste de audiencias y creativos según quién califica mejor; se descartan los segmentos que solo generan curiosos.</w:t>
+            </w:r>
+          </w:p>
+        </w:tc>
+      </w:tr>
+      <w:tr>
+        <w:tc>
+          <w:tcPr>
+            <w:tcW w:type="dxa" w:w="3400"/>
+            <w:shd w:fill="FFFFFF" w:val="clear"/>
+            <w:tcMar>
+              <w:top w:type="dxa" w:w="100"/>
+              <w:left w:type="dxa" w:w="150"/>
+              <w:bottom w:type="dxa" w:w="100"/>
+              <w:right w:type="dxa" w:w="150"/>
+            </w:tcMar>
+          </w:tcPr>
+          <w:p>
+            <w:r>
+              <w:rPr>
+                <w:rFonts w:ascii="Calibri" w:cs="Calibri" w:eastAsia="Calibri" w:hAnsi="Calibri"/>
+                <w:b w:val="false"/>
+                <w:bCs w:val="false"/>
+                <w:color w:val="222222"/>
+                <w:sz w:val="20"/>
+                <w:szCs w:val="20"/>
+              </w:rPr>
+              <w:t xml:space="preserve">Mes 3 — Escalamiento</w:t>
+            </w:r>
+          </w:p>
+        </w:tc>
+        <w:tc>
+          <w:tcPr>
+            <w:tcW w:type="dxa" w:w="5800"/>
+            <w:shd w:fill="FFFFFF" w:val="clear"/>
+            <w:tcMar>
+              <w:top w:type="dxa" w:w="100"/>
+              <w:left w:type="dxa" w:w="150"/>
+              <w:bottom w:type="dxa" w:w="100"/>
+              <w:right w:type="dxa" w:w="150"/>
+            </w:tcMar>
+          </w:tcPr>
+          <w:p>
+            <w:r>
+              <w:rPr>
+                <w:rFonts w:ascii="Calibri" w:cs="Calibri" w:eastAsia="Calibri" w:hAnsi="Calibri"/>
+                <w:b w:val="false"/>
+                <w:bCs w:val="false"/>
+                <w:color w:val="222222"/>
+                <w:sz w:val="20"/>
+                <w:szCs w:val="20"/>
+              </w:rPr>
+              <w:t xml:space="preserve">Escalamiento de presupuesto en las audiencias de mejor desempeño; remarketing sobre quienes interactuaron sin calificar aún.</w:t>
+            </w:r>
+          </w:p>
+        </w:tc>
+      </w:tr>
+    </w:tbl>
+    <w:p>
+      <w:pPr>
+        <w:spacing w:before="200"/>
+      </w:pPr>
     </w:p>
     <w:p>
       <w:pPr>
@@ -2306,7 +2485,7 @@
           <w:sz w:val="30"/>
           <w:szCs w:val="30"/>
         </w:rPr>
-        <w:t xml:space="preserve">9. Cronograma semana a semana (12 semanas)</w:t>
+        <w:t xml:space="preserve">10. Cronograma semana a semana (12 semanas)</w:t>
       </w:r>
     </w:p>
     <w:tbl>
@@ -2424,7 +2603,7 @@
                 <w:sz w:val="20"/>
                 <w:szCs w:val="20"/>
               </w:rPr>
-              <w:t xml:space="preserve">Preparación de materiales (teaser, landing, NDA, dossier) y auditoría legal en paralelo</w:t>
+              <w:t xml:space="preserve">Preparación de teaser, landing y formulario de calificación</w:t>
             </w:r>
           </w:p>
         </w:tc>
@@ -2528,7 +2707,7 @@
                 <w:sz w:val="20"/>
                 <w:szCs w:val="20"/>
               </w:rPr>
-              <w:t xml:space="preserve">Primeras calificaciones y llamadas de interés</w:t>
+              <w:t xml:space="preserve">Primeras entregas de interesados calificados a los propietarios</w:t>
             </w:r>
           </w:p>
         </w:tc>
@@ -2580,7 +2759,7 @@
                 <w:sz w:val="20"/>
                 <w:szCs w:val="20"/>
               </w:rPr>
-              <w:t xml:space="preserve">Primeras visitas presenciales al edificio</w:t>
+              <w:t xml:space="preserve">Optimización de segmentación y creativos según resultados</w:t>
             </w:r>
           </w:p>
         </w:tc>
@@ -2632,7 +2811,7 @@
                 <w:sz w:val="20"/>
                 <w:szCs w:val="20"/>
               </w:rPr>
-              <w:t xml:space="preserve">Negociaciones iniciales y remarketing sobre calificados</w:t>
+              <w:t xml:space="preserve">Escalamiento de presupuesto en las audiencias de mejor desempeño</w:t>
             </w:r>
           </w:p>
         </w:tc>
@@ -2684,7 +2863,7 @@
                 <w:sz w:val="20"/>
                 <w:szCs w:val="20"/>
               </w:rPr>
-              <w:t xml:space="preserve">Cierre con el interesado más avanzado, o evaluación de extender el plazo</w:t>
+              <w:t xml:space="preserve">Remarketing continuo y balance de resultados con los propietarios</w:t>
             </w:r>
           </w:p>
         </w:tc>
@@ -2706,7 +2885,7 @@
           <w:sz w:val="21"/>
           <w:szCs w:val="21"/>
         </w:rPr>
-        <w:t xml:space="preserve">Si al cierre de la semana 12 no se ha concretado la venta, el plan continúa: se prioriza a los interesados más avanzados y se evalúa ajustar la segmentación o el mensaje de difusión, según lo acordado con los propietarios.</w:t>
+        <w:t xml:space="preserve">Si al cierre de la semana 12 no se ha concretado una venta, esta gestión digital puede continuar (con apertura a extender el plazo), mientras los propietarios avanzan en paralelo con los interesados ya entregados.</w:t>
       </w:r>
     </w:p>
     <w:p>
@@ -2731,7 +2910,7 @@
           <w:sz w:val="30"/>
           <w:szCs w:val="30"/>
         </w:rPr>
-        <w:t xml:space="preserve">10. Honorarios y condiciones de pago</w:t>
+        <w:t xml:space="preserve">11. Honorarios y condiciones de pago</w:t>
       </w:r>
     </w:p>
     <w:tbl>
@@ -2824,7 +3003,7 @@
                 <w:sz w:val="20"/>
                 <w:szCs w:val="20"/>
               </w:rPr>
-              <w:t xml:space="preserve">Honorarios de gestión: $950.000 / mes</w:t>
+              <w:t xml:space="preserve">Honorarios de gestión digital: $950.000 / mes</w:t>
             </w:r>
           </w:p>
         </w:tc>
@@ -2849,7 +3028,7 @@
                 <w:sz w:val="20"/>
                 <w:szCs w:val="20"/>
               </w:rPr>
-              <w:t xml:space="preserve">Cubre estrategia, difusión, calificación y gestión operativa. Los propietarios asumen aparte el presupuesto de pauta en Meta Ads. Se paga siempre, sin importar el origen del comprador final.</w:t>
+              <w:t xml:space="preserve">Cubre estrategia, creación y optimización de campañas en Meta Ads para generar y filtrar interesados calificados. Los propietarios asumen aparte el presupuesto de pauta. Se paga siempre, sin importar el origen del comprador final.</w:t>
             </w:r>
           </w:p>
         </w:tc>
@@ -2901,7 +3080,7 @@
                 <w:sz w:val="20"/>
                 <w:szCs w:val="20"/>
               </w:rPr>
-              <w:t xml:space="preserve">Aplica únicamente si el comprador que cierra la operación es entregado directamente por esta gestión. Si el cierre se da por un contacto ajeno a esta campaña, no aplica.</w:t>
+              <w:t xml:space="preserve">Aplica únicamente si el comprador que cierra la operación es entregado directamente por esta gestión de Meta Ads. Si el cierre se da por un contacto ajeno a esta campaña, no aplica.</w:t>
             </w:r>
           </w:p>
         </w:tc>
@@ -2923,7 +3102,7 @@
           <w:sz w:val="21"/>
           <w:szCs w:val="21"/>
         </w:rPr>
-        <w:t xml:space="preserve">Este esquema alinea el incentivo del equipo de gestión con el resultado final (la venta), sin penalizar a los propietarios si el comprador surge por un canal distinto al de esta campaña.</w:t>
+        <w:t xml:space="preserve">Este esquema remunera específicamente la gestión digital (generación y filtro de interesados) y reconoce con una comisión adicional el caso en que el comprador final provenga directamente de esta campaña.</w:t>
       </w:r>
     </w:p>
     <w:p>
@@ -2948,7 +3127,7 @@
           <w:sz w:val="30"/>
           <w:szCs w:val="30"/>
         </w:rPr>
-        <w:t xml:space="preserve">11. Riesgos y supuestos</w:t>
+        <w:t xml:space="preserve">12. Riesgos y supuestos</w:t>
       </w:r>
     </w:p>
     <w:p>
@@ -2967,7 +3146,7 @@
           <w:sz w:val="21"/>
           <w:szCs w:val="21"/>
         </w:rPr>
-        <w:t xml:space="preserve">El plazo de 3 meses es un objetivo, no una garantía: la venta de un activo de este tamaño depende también de la respuesta del mercado y de la resolución de los frentes legales.</w:t>
+        <w:t xml:space="preserve">El plazo de 3 meses es un objetivo para la generación de interesados calificados, no una garantía de venta: el cierre depende del proceso que gestionan directamente los propietarios.</w:t>
       </w:r>
     </w:p>
     <w:p>
@@ -2986,7 +3165,7 @@
           <w:sz w:val="21"/>
           <w:szCs w:val="21"/>
         </w:rPr>
-        <w:t xml:space="preserve">Si el proceso de sucesión no tiene fecha estimada de resolución, se debe informar a cualquier comprador avanzado antes de firmar compromisos vinculantes, para evitar pérdida de confianza.</w:t>
+        <w:t xml:space="preserve">Al usar Meta Ads como único canal, el volumen y calidad de interesados depende de la segmentación; se recomienda revisar el desempeño cada 2 semanas y ajustar según los perfiles que mejor califiquen.</w:t>
       </w:r>
     </w:p>
     <w:p>
@@ -3005,7 +3184,7 @@
           <w:sz w:val="21"/>
           <w:szCs w:val="21"/>
         </w:rPr>
-        <w:t xml:space="preserve">Al usar Meta Ads como único canal, la campaña depende de la calidad de la segmentación; se recomienda revisar el desempeño cada 2 semanas y ajustar según los perfiles que mejor califiquen.</w:t>
+        <w:t xml:space="preserve">Toda cifra financiera comunicada en la campaña debe ser bruta y estar claramente etiquetada como tal.</w:t>
       </w:r>
     </w:p>
     <w:p>
@@ -3024,7 +3203,7 @@
           <w:sz w:val="21"/>
           <w:szCs w:val="21"/>
         </w:rPr>
-        <w:t xml:space="preserve">Toda cifra financiera comunicada al mercado debe ser bruta y estar claramente etiquetada como tal.</w:t>
+        <w:t xml:space="preserve">Esta gestión no asume responsabilidad sobre la verificación adicional, la negociación, los aspectos legales (hipoteca, sucesión) ni el cierre de la venta.</w:t>
       </w:r>
     </w:p>
     <w:sectPr>
@@ -3164,7 +3343,7 @@
         <w:sz w:val="16"/>
         <w:szCs w:val="16"/>
       </w:rPr>
-      <w:t xml:space="preserve">Hosty56 · Plan de Trabajo Operativo</w:t>
+      <w:t xml:space="preserve">Hosty56 · Plan de Gestión Digital (Meta Ads)</w:t>
     </w:r>
   </w:p>
 </w:hdr>
@@ -3306,12 +3485,6 @@
   </w:num>
   <w:num w:numId="3">
     <w:abstractNumId w:val="3"/>
-    <w:lvlOverride w:ilvl="0">
-      <w:startOverride w:val="1"/>
-    </w:lvlOverride>
-  </w:num>
-  <w:num w:numId="4">
-    <w:abstractNumId w:val="4"/>
     <w:lvlOverride w:ilvl="0">
       <w:startOverride w:val="1"/>
     </w:lvlOverride>

</xml_diff>